<commit_message>
Updated by Gaurav on 29-06-2026
Organization APIs update
</commit_message>
<xml_diff>
--- a/Documents/API_Documentation_v4.1.docx
+++ b/Documents/API_Documentation_v4.1.docx
@@ -3387,6 +3387,631 @@
           </w:p>
         </w:tc>
       </w:tr>
+      <w:tr>
+        <w:tblPrEx>
+          <w:tblCellMar>
+            <w:top w:w="0" w:type="dxa"/>
+            <w:bottom w:w="0" w:type="dxa"/>
+          </w:tblCellMar>
+        </w:tblPrEx>
+        <w:tc>
+          <w:tcPr>
+            <w:tcW w:w="1100" w:type="dxa"/>
+            <w:tcBorders>
+              <w:top w:val="single" w:sz="1" w:space="0" w:color="CCCCCC"/>
+              <w:left w:val="single" w:sz="1" w:space="0" w:color="CCCCCC"/>
+              <w:bottom w:val="single" w:sz="1" w:space="0" w:color="CCCCCC"/>
+              <w:right w:val="single" w:sz="1" w:space="0" w:color="CCCCCC"/>
+            </w:tcBorders>
+            <w:shd w:val="clear" w:color="auto" w:fill="27AE60"/>
+            <w:tcMar>
+              <w:top w:w="60" w:type="dxa"/>
+              <w:left w:w="100" w:type="dxa"/>
+              <w:bottom w:w="60" w:type="dxa"/>
+              <w:right w:w="100" w:type="dxa"/>
+            </w:tcMar>
+          </w:tcPr>
+          <w:p>
+            <w:r>
+              <w:rPr>
+                <w:rFonts w:ascii="Courier New" w:eastAsia="Courier New" w:hAnsi="Courier New" w:cs="Courier New"/>
+                <w:b/>
+                <w:bCs/>
+                <w:color w:val="FFFFFF"/>
+                <w:sz w:val="17"/>
+                <w:szCs w:val="17"/>
+              </w:rPr>
+              <w:t>GET</w:t>
+            </w:r>
+          </w:p>
+        </w:tc>
+        <w:tc>
+          <w:tcPr>
+            <w:tcW w:w="3900" w:type="dxa"/>
+            <w:tcBorders>
+              <w:top w:val="single" w:sz="1" w:space="0" w:color="CCCCCC"/>
+              <w:left w:val="single" w:sz="1" w:space="0" w:color="CCCCCC"/>
+              <w:bottom w:val="single" w:sz="1" w:space="0" w:color="CCCCCC"/>
+              <w:right w:val="single" w:sz="1" w:space="0" w:color="CCCCCC"/>
+            </w:tcBorders>
+            <w:tcMar>
+              <w:top w:w="60" w:type="dxa"/>
+              <w:left w:w="100" w:type="dxa"/>
+              <w:bottom w:w="60" w:type="dxa"/>
+              <w:right w:w="100" w:type="dxa"/>
+            </w:tcMar>
+          </w:tcPr>
+          <w:p>
+            <w:r>
+              <w:rPr>
+                <w:rFonts w:ascii="Courier New" w:eastAsia="Courier New" w:hAnsi="Courier New" w:cs="Courier New"/>
+                <w:color w:val="2C3E50"/>
+                <w:sz w:val="17"/>
+                <w:szCs w:val="17"/>
+              </w:rPr>
+              <w:t xml:space="preserve">/user/safety-prefs</w:t>
+            </w:r>
+          </w:p>
+        </w:tc>
+        <w:tc>
+          <w:tcPr>
+            <w:tcW w:w="700" w:type="dxa"/>
+            <w:tcBorders>
+              <w:top w:val="single" w:sz="1" w:space="0" w:color="CCCCCC"/>
+              <w:left w:val="single" w:sz="1" w:space="0" w:color="CCCCCC"/>
+              <w:bottom w:val="single" w:sz="1" w:space="0" w:color="CCCCCC"/>
+              <w:right w:val="single" w:sz="1" w:space="0" w:color="CCCCCC"/>
+            </w:tcBorders>
+            <w:tcMar>
+              <w:top w:w="60" w:type="dxa"/>
+              <w:left w:w="80" w:type="dxa"/>
+              <w:bottom w:w="60" w:type="dxa"/>
+              <w:right w:w="80" w:type="dxa"/>
+            </w:tcMar>
+          </w:tcPr>
+          <w:p>
+            <w:pPr>
+              <w:jc w:val="center"/>
+            </w:pPr>
+            <w:r>
+              <w:rPr>
+                <w:b/>
+                <w:bCs/>
+                <w:color w:val="1A7340"/>
+                <w:sz w:val="17"/>
+                <w:szCs w:val="17"/>
+              </w:rPr>
+              <w:t>YES</w:t>
+            </w:r>
+          </w:p>
+        </w:tc>
+        <w:tc>
+          <w:tcPr>
+            <w:tcW w:w="3660" w:type="dxa"/>
+            <w:tcBorders>
+              <w:top w:val="single" w:sz="1" w:space="0" w:color="CCCCCC"/>
+              <w:left w:val="single" w:sz="1" w:space="0" w:color="CCCCCC"/>
+              <w:bottom w:val="single" w:sz="1" w:space="0" w:color="CCCCCC"/>
+              <w:right w:val="single" w:sz="1" w:space="0" w:color="CCCCCC"/>
+            </w:tcBorders>
+            <w:tcMar>
+              <w:top w:w="60" w:type="dxa"/>
+              <w:left w:w="100" w:type="dxa"/>
+              <w:bottom w:w="60" w:type="dxa"/>
+              <w:right w:w="100" w:type="dxa"/>
+            </w:tcMar>
+          </w:tcPr>
+          <w:p>
+            <w:r>
+              <w:rPr>
+                <w:sz w:val="19"/>
+                <w:szCs w:val="19"/>
+              </w:rPr>
+              <w:t xml:space="preserve">Get safety preferences (for Edit Profile step pre-fill). Response: { emergVisibilityLkpId, emergVisibility, autoShareDurLkpId, autoShareDuration, allowLocDuringSos, allowLocDuringProj, emergencyContactName, emergencyContactPhone, emergencyContactRelation }</w:t>
+            </w:r>
+          </w:p>
+        </w:tc>
+      </w:tr>
+      <w:tr>
+        <w:tblPrEx>
+          <w:tblCellMar>
+            <w:top w:w="0" w:type="dxa"/>
+            <w:bottom w:w="0" w:type="dxa"/>
+          </w:tblCellMar>
+        </w:tblPrEx>
+        <w:tc>
+          <w:tcPr>
+            <w:tcW w:w="1100" w:type="dxa"/>
+            <w:tcBorders>
+              <w:top w:val="single" w:sz="1" w:space="0" w:color="CCCCCC"/>
+              <w:left w:val="single" w:sz="1" w:space="0" w:color="CCCCCC"/>
+              <w:bottom w:val="single" w:sz="1" w:space="0" w:color="CCCCCC"/>
+              <w:right w:val="single" w:sz="1" w:space="0" w:color="CCCCCC"/>
+            </w:tcBorders>
+            <w:shd w:val="clear" w:color="auto" w:fill="27AE60"/>
+            <w:tcMar>
+              <w:top w:w="60" w:type="dxa"/>
+              <w:left w:w="100" w:type="dxa"/>
+              <w:bottom w:w="60" w:type="dxa"/>
+              <w:right w:w="100" w:type="dxa"/>
+            </w:tcMar>
+          </w:tcPr>
+          <w:p>
+            <w:r>
+              <w:rPr>
+                <w:rFonts w:ascii="Courier New" w:eastAsia="Courier New" w:hAnsi="Courier New" w:cs="Courier New"/>
+                <w:b/>
+                <w:bCs/>
+                <w:color w:val="FFFFFF"/>
+                <w:sz w:val="17"/>
+                <w:szCs w:val="17"/>
+              </w:rPr>
+              <w:t>GET</w:t>
+            </w:r>
+          </w:p>
+        </w:tc>
+        <w:tc>
+          <w:tcPr>
+            <w:tcW w:w="3900" w:type="dxa"/>
+            <w:tcBorders>
+              <w:top w:val="single" w:sz="1" w:space="0" w:color="CCCCCC"/>
+              <w:left w:val="single" w:sz="1" w:space="0" w:color="CCCCCC"/>
+              <w:bottom w:val="single" w:sz="1" w:space="0" w:color="CCCCCC"/>
+              <w:right w:val="single" w:sz="1" w:space="0" w:color="CCCCCC"/>
+            </w:tcBorders>
+            <w:tcMar>
+              <w:top w:w="60" w:type="dxa"/>
+              <w:left w:w="100" w:type="dxa"/>
+              <w:bottom w:w="60" w:type="dxa"/>
+              <w:right w:w="100" w:type="dxa"/>
+            </w:tcMar>
+          </w:tcPr>
+          <w:p>
+            <w:r>
+              <w:rPr>
+                <w:rFonts w:ascii="Courier New" w:eastAsia="Courier New" w:hAnsi="Courier New" w:cs="Courier New"/>
+                <w:color w:val="2C3E50"/>
+                <w:sz w:val="17"/>
+                <w:szCs w:val="17"/>
+              </w:rPr>
+              <w:t xml:space="preserve">/user/interests</w:t>
+            </w:r>
+          </w:p>
+        </w:tc>
+        <w:tc>
+          <w:tcPr>
+            <w:tcW w:w="700" w:type="dxa"/>
+            <w:tcBorders>
+              <w:top w:val="single" w:sz="1" w:space="0" w:color="CCCCCC"/>
+              <w:left w:val="single" w:sz="1" w:space="0" w:color="CCCCCC"/>
+              <w:bottom w:val="single" w:sz="1" w:space="0" w:color="CCCCCC"/>
+              <w:right w:val="single" w:sz="1" w:space="0" w:color="CCCCCC"/>
+            </w:tcBorders>
+            <w:tcMar>
+              <w:top w:w="60" w:type="dxa"/>
+              <w:left w:w="80" w:type="dxa"/>
+              <w:bottom w:w="60" w:type="dxa"/>
+              <w:right w:w="80" w:type="dxa"/>
+            </w:tcMar>
+          </w:tcPr>
+          <w:p>
+            <w:pPr>
+              <w:jc w:val="center"/>
+            </w:pPr>
+            <w:r>
+              <w:rPr>
+                <w:b/>
+                <w:bCs/>
+                <w:color w:val="1A7340"/>
+                <w:sz w:val="17"/>
+                <w:szCs w:val="17"/>
+              </w:rPr>
+              <w:t>YES</w:t>
+            </w:r>
+          </w:p>
+        </w:tc>
+        <w:tc>
+          <w:tcPr>
+            <w:tcW w:w="3660" w:type="dxa"/>
+            <w:tcBorders>
+              <w:top w:val="single" w:sz="1" w:space="0" w:color="CCCCCC"/>
+              <w:left w:val="single" w:sz="1" w:space="0" w:color="CCCCCC"/>
+              <w:bottom w:val="single" w:sz="1" w:space="0" w:color="CCCCCC"/>
+              <w:right w:val="single" w:sz="1" w:space="0" w:color="CCCCCC"/>
+            </w:tcBorders>
+            <w:tcMar>
+              <w:top w:w="60" w:type="dxa"/>
+              <w:left w:w="100" w:type="dxa"/>
+              <w:bottom w:w="60" w:type="dxa"/>
+              <w:right w:w="100" w:type="dxa"/>
+            </w:tcMar>
+          </w:tcPr>
+          <w:p>
+            <w:r>
+              <w:rPr>
+                <w:sz w:val="19"/>
+                <w:szCs w:val="19"/>
+              </w:rPr>
+              <w:t xml:space="preserve">Get saved interests (for Edit Profile interests step pre-fill). Response: [{ interestLkpId, interestName, interestCode }]</w:t>
+            </w:r>
+          </w:p>
+        </w:tc>
+      </w:tr>
+      <w:tr>
+        <w:tblPrEx>
+          <w:tblCellMar>
+            <w:top w:w="0" w:type="dxa"/>
+            <w:bottom w:w="0" w:type="dxa"/>
+          </w:tblCellMar>
+        </w:tblPrEx>
+        <w:tc>
+          <w:tcPr>
+            <w:tcW w:w="1100" w:type="dxa"/>
+            <w:tcBorders>
+              <w:top w:val="single" w:sz="1" w:space="0" w:color="CCCCCC"/>
+              <w:left w:val="single" w:sz="1" w:space="0" w:color="CCCCCC"/>
+              <w:bottom w:val="single" w:sz="1" w:space="0" w:color="CCCCCC"/>
+              <w:right w:val="single" w:sz="1" w:space="0" w:color="CCCCCC"/>
+            </w:tcBorders>
+            <w:shd w:val="clear" w:color="auto" w:fill="27AE60"/>
+            <w:tcMar>
+              <w:top w:w="60" w:type="dxa"/>
+              <w:left w:w="100" w:type="dxa"/>
+              <w:bottom w:w="60" w:type="dxa"/>
+              <w:right w:w="100" w:type="dxa"/>
+            </w:tcMar>
+          </w:tcPr>
+          <w:p>
+            <w:r>
+              <w:rPr>
+                <w:rFonts w:ascii="Courier New" w:eastAsia="Courier New" w:hAnsi="Courier New" w:cs="Courier New"/>
+                <w:b/>
+                <w:bCs/>
+                <w:color w:val="FFFFFF"/>
+                <w:sz w:val="17"/>
+                <w:szCs w:val="17"/>
+              </w:rPr>
+              <w:t>GET</w:t>
+            </w:r>
+          </w:p>
+        </w:tc>
+        <w:tc>
+          <w:tcPr>
+            <w:tcW w:w="3900" w:type="dxa"/>
+            <w:tcBorders>
+              <w:top w:val="single" w:sz="1" w:space="0" w:color="CCCCCC"/>
+              <w:left w:val="single" w:sz="1" w:space="0" w:color="CCCCCC"/>
+              <w:bottom w:val="single" w:sz="1" w:space="0" w:color="CCCCCC"/>
+              <w:right w:val="single" w:sz="1" w:space="0" w:color="CCCCCC"/>
+            </w:tcBorders>
+            <w:tcMar>
+              <w:top w:w="60" w:type="dxa"/>
+              <w:left w:w="100" w:type="dxa"/>
+              <w:bottom w:w="60" w:type="dxa"/>
+              <w:right w:w="100" w:type="dxa"/>
+            </w:tcMar>
+          </w:tcPr>
+          <w:p>
+            <w:r>
+              <w:rPr>
+                <w:rFonts w:ascii="Courier New" w:eastAsia="Courier New" w:hAnsi="Courier New" w:cs="Courier New"/>
+                <w:color w:val="2C3E50"/>
+                <w:sz w:val="17"/>
+                <w:szCs w:val="17"/>
+              </w:rPr>
+              <w:t xml:space="preserve">/user/my-orgs</w:t>
+            </w:r>
+          </w:p>
+        </w:tc>
+        <w:tc>
+          <w:tcPr>
+            <w:tcW w:w="700" w:type="dxa"/>
+            <w:tcBorders>
+              <w:top w:val="single" w:sz="1" w:space="0" w:color="CCCCCC"/>
+              <w:left w:val="single" w:sz="1" w:space="0" w:color="CCCCCC"/>
+              <w:bottom w:val="single" w:sz="1" w:space="0" w:color="CCCCCC"/>
+              <w:right w:val="single" w:sz="1" w:space="0" w:color="CCCCCC"/>
+            </w:tcBorders>
+            <w:tcMar>
+              <w:top w:w="60" w:type="dxa"/>
+              <w:left w:w="80" w:type="dxa"/>
+              <w:bottom w:w="60" w:type="dxa"/>
+              <w:right w:w="80" w:type="dxa"/>
+            </w:tcMar>
+          </w:tcPr>
+          <w:p>
+            <w:pPr>
+              <w:jc w:val="center"/>
+            </w:pPr>
+            <w:r>
+              <w:rPr>
+                <w:b/>
+                <w:bCs/>
+                <w:color w:val="1A7340"/>
+                <w:sz w:val="17"/>
+                <w:szCs w:val="17"/>
+              </w:rPr>
+              <w:t>YES</w:t>
+            </w:r>
+          </w:p>
+        </w:tc>
+        <w:tc>
+          <w:tcPr>
+            <w:tcW w:w="3660" w:type="dxa"/>
+            <w:tcBorders>
+              <w:top w:val="single" w:sz="1" w:space="0" w:color="CCCCCC"/>
+              <w:left w:val="single" w:sz="1" w:space="0" w:color="CCCCCC"/>
+              <w:bottom w:val="single" w:sz="1" w:space="0" w:color="CCCCCC"/>
+              <w:right w:val="single" w:sz="1" w:space="0" w:color="CCCCCC"/>
+            </w:tcBorders>
+            <w:tcMar>
+              <w:top w:w="60" w:type="dxa"/>
+              <w:left w:w="100" w:type="dxa"/>
+              <w:bottom w:w="60" w:type="dxa"/>
+              <w:right w:w="100" w:type="dxa"/>
+            </w:tcMar>
+          </w:tcPr>
+          <w:p>
+            <w:r>
+              <w:rPr>
+                <w:sz w:val="19"/>
+                <w:szCs w:val="19"/>
+              </w:rPr>
+              <w:t xml:space="preserve">Get all organisations the user is an APPROVED member of (s-my-orgs screen). Response: [{ orgId, orgName, logoUrl, orgType, city, state, role, roleCode, memberCount, joinedAt }]</w:t>
+            </w:r>
+          </w:p>
+        </w:tc>
+      </w:tr>
+      <w:tr>
+        <w:tblPrEx>
+          <w:tblCellMar>
+            <w:top w:w="0" w:type="dxa"/>
+            <w:bottom w:w="0" w:type="dxa"/>
+          </w:tblCellMar>
+        </w:tblPrEx>
+        <w:tc>
+          <w:tcPr>
+            <w:tcW w:w="1100" w:type="dxa"/>
+            <w:tcBorders>
+              <w:top w:val="single" w:sz="1" w:space="0" w:color="CCCCCC"/>
+              <w:left w:val="single" w:sz="1" w:space="0" w:color="CCCCCC"/>
+              <w:bottom w:val="single" w:sz="1" w:space="0" w:color="CCCCCC"/>
+              <w:right w:val="single" w:sz="1" w:space="0" w:color="CCCCCC"/>
+            </w:tcBorders>
+            <w:shd w:val="clear" w:color="auto" w:fill="27AE60"/>
+            <w:tcMar>
+              <w:top w:w="60" w:type="dxa"/>
+              <w:left w:w="100" w:type="dxa"/>
+              <w:bottom w:w="60" w:type="dxa"/>
+              <w:right w:w="100" w:type="dxa"/>
+            </w:tcMar>
+          </w:tcPr>
+          <w:p>
+            <w:r>
+              <w:rPr>
+                <w:rFonts w:ascii="Courier New" w:eastAsia="Courier New" w:hAnsi="Courier New" w:cs="Courier New"/>
+                <w:b/>
+                <w:bCs/>
+                <w:color w:val="FFFFFF"/>
+                <w:sz w:val="17"/>
+                <w:szCs w:val="17"/>
+              </w:rPr>
+              <w:t>GET</w:t>
+            </w:r>
+          </w:p>
+        </w:tc>
+        <w:tc>
+          <w:tcPr>
+            <w:tcW w:w="3900" w:type="dxa"/>
+            <w:tcBorders>
+              <w:top w:val="single" w:sz="1" w:space="0" w:color="CCCCCC"/>
+              <w:left w:val="single" w:sz="1" w:space="0" w:color="CCCCCC"/>
+              <w:bottom w:val="single" w:sz="1" w:space="0" w:color="CCCCCC"/>
+              <w:right w:val="single" w:sz="1" w:space="0" w:color="CCCCCC"/>
+            </w:tcBorders>
+            <w:tcMar>
+              <w:top w:w="60" w:type="dxa"/>
+              <w:left w:w="100" w:type="dxa"/>
+              <w:bottom w:w="60" w:type="dxa"/>
+              <w:right w:w="100" w:type="dxa"/>
+            </w:tcMar>
+          </w:tcPr>
+          <w:p>
+            <w:r>
+              <w:rPr>
+                <w:rFonts w:ascii="Courier New" w:eastAsia="Courier New" w:hAnsi="Courier New" w:cs="Courier New"/>
+                <w:color w:val="2C3E50"/>
+                <w:sz w:val="17"/>
+                <w:szCs w:val="17"/>
+              </w:rPr>
+              <w:t xml:space="preserve">/user/badges</w:t>
+            </w:r>
+          </w:p>
+        </w:tc>
+        <w:tc>
+          <w:tcPr>
+            <w:tcW w:w="700" w:type="dxa"/>
+            <w:tcBorders>
+              <w:top w:val="single" w:sz="1" w:space="0" w:color="CCCCCC"/>
+              <w:left w:val="single" w:sz="1" w:space="0" w:color="CCCCCC"/>
+              <w:bottom w:val="single" w:sz="1" w:space="0" w:color="CCCCCC"/>
+              <w:right w:val="single" w:sz="1" w:space="0" w:color="CCCCCC"/>
+            </w:tcBorders>
+            <w:tcMar>
+              <w:top w:w="60" w:type="dxa"/>
+              <w:left w:w="80" w:type="dxa"/>
+              <w:bottom w:w="60" w:type="dxa"/>
+              <w:right w:w="80" w:type="dxa"/>
+            </w:tcMar>
+          </w:tcPr>
+          <w:p>
+            <w:pPr>
+              <w:jc w:val="center"/>
+            </w:pPr>
+            <w:r>
+              <w:rPr>
+                <w:b/>
+                <w:bCs/>
+                <w:color w:val="1A7340"/>
+                <w:sz w:val="17"/>
+                <w:szCs w:val="17"/>
+              </w:rPr>
+              <w:t>YES</w:t>
+            </w:r>
+          </w:p>
+        </w:tc>
+        <w:tc>
+          <w:tcPr>
+            <w:tcW w:w="3660" w:type="dxa"/>
+            <w:tcBorders>
+              <w:top w:val="single" w:sz="1" w:space="0" w:color="CCCCCC"/>
+              <w:left w:val="single" w:sz="1" w:space="0" w:color="CCCCCC"/>
+              <w:bottom w:val="single" w:sz="1" w:space="0" w:color="CCCCCC"/>
+              <w:right w:val="single" w:sz="1" w:space="0" w:color="CCCCCC"/>
+            </w:tcBorders>
+            <w:tcMar>
+              <w:top w:w="60" w:type="dxa"/>
+              <w:left w:w="100" w:type="dxa"/>
+              <w:bottom w:w="60" w:type="dxa"/>
+              <w:right w:w="100" w:type="dxa"/>
+            </w:tcMar>
+          </w:tcPr>
+          <w:p>
+            <w:r>
+              <w:rPr>
+                <w:sz w:val="19"/>
+                <w:szCs w:val="19"/>
+              </w:rPr>
+              <w:t xml:space="preserve">Get all earned badges (s-impact screen). Response: [{ userBadgeId, badgeLkpId, badgeName, badgeCode, orgName, projectName, awardedAt }]</w:t>
+            </w:r>
+          </w:p>
+        </w:tc>
+      </w:tr>
+      <w:tr>
+        <w:tblPrEx>
+          <w:tblCellMar>
+            <w:top w:w="0" w:type="dxa"/>
+            <w:bottom w:w="0" w:type="dxa"/>
+          </w:tblCellMar>
+        </w:tblPrEx>
+        <w:tc>
+          <w:tcPr>
+            <w:tcW w:w="1100" w:type="dxa"/>
+            <w:tcBorders>
+              <w:top w:val="single" w:sz="1" w:space="0" w:color="CCCCCC"/>
+              <w:left w:val="single" w:sz="1" w:space="0" w:color="CCCCCC"/>
+              <w:bottom w:val="single" w:sz="1" w:space="0" w:color="CCCCCC"/>
+              <w:right w:val="single" w:sz="1" w:space="0" w:color="CCCCCC"/>
+            </w:tcBorders>
+            <w:shd w:val="clear" w:color="auto" w:fill="27AE60"/>
+            <w:tcMar>
+              <w:top w:w="60" w:type="dxa"/>
+              <w:left w:w="100" w:type="dxa"/>
+              <w:bottom w:w="60" w:type="dxa"/>
+              <w:right w:w="100" w:type="dxa"/>
+            </w:tcMar>
+          </w:tcPr>
+          <w:p>
+            <w:r>
+              <w:rPr>
+                <w:rFonts w:ascii="Courier New" w:eastAsia="Courier New" w:hAnsi="Courier New" w:cs="Courier New"/>
+                <w:b/>
+                <w:bCs/>
+                <w:color w:val="FFFFFF"/>
+                <w:sz w:val="17"/>
+                <w:szCs w:val="17"/>
+              </w:rPr>
+              <w:t>GET</w:t>
+            </w:r>
+          </w:p>
+        </w:tc>
+        <w:tc>
+          <w:tcPr>
+            <w:tcW w:w="3900" w:type="dxa"/>
+            <w:tcBorders>
+              <w:top w:val="single" w:sz="1" w:space="0" w:color="CCCCCC"/>
+              <w:left w:val="single" w:sz="1" w:space="0" w:color="CCCCCC"/>
+              <w:bottom w:val="single" w:sz="1" w:space="0" w:color="CCCCCC"/>
+              <w:right w:val="single" w:sz="1" w:space="0" w:color="CCCCCC"/>
+            </w:tcBorders>
+            <w:tcMar>
+              <w:top w:w="60" w:type="dxa"/>
+              <w:left w:w="100" w:type="dxa"/>
+              <w:bottom w:w="60" w:type="dxa"/>
+              <w:right w:w="100" w:type="dxa"/>
+            </w:tcMar>
+          </w:tcPr>
+          <w:p>
+            <w:r>
+              <w:rPr>
+                <w:rFonts w:ascii="Courier New" w:eastAsia="Courier New" w:hAnsi="Courier New" w:cs="Courier New"/>
+                <w:color w:val="2C3E50"/>
+                <w:sz w:val="17"/>
+                <w:szCs w:val="17"/>
+              </w:rPr>
+              <w:t xml:space="preserve">/user/impact</w:t>
+            </w:r>
+          </w:p>
+        </w:tc>
+        <w:tc>
+          <w:tcPr>
+            <w:tcW w:w="700" w:type="dxa"/>
+            <w:tcBorders>
+              <w:top w:val="single" w:sz="1" w:space="0" w:color="CCCCCC"/>
+              <w:left w:val="single" w:sz="1" w:space="0" w:color="CCCCCC"/>
+              <w:bottom w:val="single" w:sz="1" w:space="0" w:color="CCCCCC"/>
+              <w:right w:val="single" w:sz="1" w:space="0" w:color="CCCCCC"/>
+            </w:tcBorders>
+            <w:tcMar>
+              <w:top w:w="60" w:type="dxa"/>
+              <w:left w:w="80" w:type="dxa"/>
+              <w:bottom w:w="60" w:type="dxa"/>
+              <w:right w:w="80" w:type="dxa"/>
+            </w:tcMar>
+          </w:tcPr>
+          <w:p>
+            <w:pPr>
+              <w:jc w:val="center"/>
+            </w:pPr>
+            <w:r>
+              <w:rPr>
+                <w:b/>
+                <w:bCs/>
+                <w:color w:val="1A7340"/>
+                <w:sz w:val="17"/>
+                <w:szCs w:val="17"/>
+              </w:rPr>
+              <w:t>YES</w:t>
+            </w:r>
+          </w:p>
+        </w:tc>
+        <w:tc>
+          <w:tcPr>
+            <w:tcW w:w="3660" w:type="dxa"/>
+            <w:tcBorders>
+              <w:top w:val="single" w:sz="1" w:space="0" w:color="CCCCCC"/>
+              <w:left w:val="single" w:sz="1" w:space="0" w:color="CCCCCC"/>
+              <w:bottom w:val="single" w:sz="1" w:space="0" w:color="CCCCCC"/>
+              <w:right w:val="single" w:sz="1" w:space="0" w:color="CCCCCC"/>
+            </w:tcBorders>
+            <w:tcMar>
+              <w:top w:w="60" w:type="dxa"/>
+              <w:left w:w="100" w:type="dxa"/>
+              <w:bottom w:w="60" w:type="dxa"/>
+              <w:right w:w="100" w:type="dxa"/>
+            </w:tcMar>
+          </w:tcPr>
+          <w:p>
+            <w:r>
+              <w:rPr>
+                <w:sz w:val="19"/>
+                <w:szCs w:val="19"/>
+              </w:rPr>
+              <w:t xml:space="preserve">Get impact dashboard stats (s-impact screen). Response: { impactScore, reliabilityPct, projectsCompleted, totalHours, badgeCount, skillCount, projectsApplied, certificateCount, memberSince }</w:t>
+            </w:r>
+          </w:p>
+        </w:tc>
+      </w:tr>
     </w:tbl>
     <w:p/>
     <w:p>
@@ -3683,7 +4308,7 @@
                 <w:sz w:val="19"/>
                 <w:szCs w:val="19"/>
               </w:rPr>
-              <w:t>Register org. Body: { orgName, registrationNumber, orgTypeLkpId, mission, vision, logoUrl, addressLine1, addressLine2, pincode, city, state, country, website, contactEmail, contactPhone }</w:t>
+              <w:t>Register org. Body: { orgName, registrationNumber, orgTypeLkpId, category, contactPerson, about, mission, vision, logoUrl, contactEmail, contactPhone, website, addressLine1, addressLine2, pincode, city, state, country }. Response: { orgId, orgName, ... full profile }</w:t>
             </w:r>
           </w:p>
         </w:tc>
@@ -3931,7 +4556,7 @@
                 <w:sz w:val="19"/>
                 <w:szCs w:val="19"/>
               </w:rPr>
-              <w:t>Update org profile (same fields as POST)</w:t>
+              <w:t>Update org profile. Body: { orgName, category, contactPerson, about, mission, vision, logoUrl, contactEmail, contactPhone, website, addressLine1, addressLine2, pincode, city, state, country }. All fields optional (COALESCE).</w:t>
             </w:r>
           </w:p>
         </w:tc>
@@ -4054,7 +4679,7 @@
                 <w:sz w:val="19"/>
                 <w:szCs w:val="19"/>
               </w:rPr>
-              <w:t>List orgs. Query: keyword, orgTypeLkpId, pageNumber, pageSize</w:t>
+              <w:t>List all APPROVED orgs (s-explore All NGOs tab). Query: keyword, category, pageNumber, pageSize. Response: PagedResult of { orgId, orgName, category, logoUrl, city, state, memberCount, avgRating, latitude, longitude }</w:t>
             </w:r>
           </w:p>
         </w:tc>
@@ -5055,6 +5680,1381 @@
                 <w:szCs w:val="19"/>
               </w:rPr>
               <w:t>Upload org document. Body: { documentTypeLkpId, fileUrl, fileName }. Call POST /media/upload?module=org-documents first to get fileUrl and fileName.</w:t>
+            </w:r>
+          </w:p>
+        </w:tc>
+      </w:tr>
+      <w:tr>
+        <w:tblPrEx>
+          <w:tblCellMar>
+            <w:top w:w="0" w:type="dxa"/>
+            <w:bottom w:w="0" w:type="dxa"/>
+          </w:tblCellMar>
+        </w:tblPrEx>
+        <w:tc>
+          <w:tcPr>
+            <w:tcW w:w="1100" w:type="dxa"/>
+            <w:tcBorders>
+              <w:top w:val="single" w:sz="1" w:space="0" w:color="CCCCCC"/>
+              <w:left w:val="single" w:sz="1" w:space="0" w:color="CCCCCC"/>
+              <w:bottom w:val="single" w:sz="1" w:space="0" w:color="CCCCCC"/>
+              <w:right w:val="single" w:sz="1" w:space="0" w:color="CCCCCC"/>
+            </w:tcBorders>
+            <w:shd w:val="clear" w:color="auto" w:fill="27AE60"/>
+            <w:tcMar>
+              <w:top w:w="60" w:type="dxa"/>
+              <w:left w:w="100" w:type="dxa"/>
+              <w:bottom w:w="60" w:type="dxa"/>
+              <w:right w:w="100" w:type="dxa"/>
+            </w:tcMar>
+          </w:tcPr>
+          <w:p>
+            <w:r>
+              <w:rPr>
+                <w:rFonts w:ascii="Courier New" w:eastAsia="Courier New" w:hAnsi="Courier New" w:cs="Courier New"/>
+                <w:b/>
+                <w:bCs/>
+                <w:color w:val="FFFFFF"/>
+                <w:sz w:val="17"/>
+                <w:szCs w:val="17"/>
+              </w:rPr>
+              <w:t>GET</w:t>
+            </w:r>
+          </w:p>
+        </w:tc>
+        <w:tc>
+          <w:tcPr>
+            <w:tcW w:w="3900" w:type="dxa"/>
+            <w:tcBorders>
+              <w:top w:val="single" w:sz="1" w:space="0" w:color="CCCCCC"/>
+              <w:left w:val="single" w:sz="1" w:space="0" w:color="CCCCCC"/>
+              <w:bottom w:val="single" w:sz="1" w:space="0" w:color="CCCCCC"/>
+              <w:right w:val="single" w:sz="1" w:space="0" w:color="CCCCCC"/>
+            </w:tcBorders>
+            <w:tcMar>
+              <w:top w:w="60" w:type="dxa"/>
+              <w:left w:w="100" w:type="dxa"/>
+              <w:bottom w:w="60" w:type="dxa"/>
+              <w:right w:w="100" w:type="dxa"/>
+            </w:tcMar>
+          </w:tcPr>
+          <w:p>
+            <w:r>
+              <w:rPr>
+                <w:rFonts w:ascii="Courier New" w:eastAsia="Courier New" w:hAnsi="Courier New" w:cs="Courier New"/>
+                <w:color w:val="2C3E50"/>
+                <w:sz w:val="17"/>
+                <w:szCs w:val="17"/>
+              </w:rPr>
+              <w:t xml:space="preserve">/org/{orgId}/dashboard</w:t>
+            </w:r>
+          </w:p>
+        </w:tc>
+        <w:tc>
+          <w:tcPr>
+            <w:tcW w:w="700" w:type="dxa"/>
+            <w:tcBorders>
+              <w:top w:val="single" w:sz="1" w:space="0" w:color="CCCCCC"/>
+              <w:left w:val="single" w:sz="1" w:space="0" w:color="CCCCCC"/>
+              <w:bottom w:val="single" w:sz="1" w:space="0" w:color="CCCCCC"/>
+              <w:right w:val="single" w:sz="1" w:space="0" w:color="CCCCCC"/>
+            </w:tcBorders>
+            <w:tcMar>
+              <w:top w:w="60" w:type="dxa"/>
+              <w:left w:w="80" w:type="dxa"/>
+              <w:bottom w:w="60" w:type="dxa"/>
+              <w:right w:w="80" w:type="dxa"/>
+            </w:tcMar>
+          </w:tcPr>
+          <w:p>
+            <w:pPr>
+              <w:jc w:val="center"/>
+            </w:pPr>
+            <w:r>
+              <w:rPr>
+                <w:b/>
+                <w:bCs/>
+                <w:color w:val="1A7340"/>
+                <w:sz w:val="17"/>
+                <w:szCs w:val="17"/>
+              </w:rPr>
+              <w:t>YES</w:t>
+            </w:r>
+          </w:p>
+        </w:tc>
+        <w:tc>
+          <w:tcPr>
+            <w:tcW w:w="3660" w:type="dxa"/>
+            <w:tcBorders>
+              <w:top w:val="single" w:sz="1" w:space="0" w:color="CCCCCC"/>
+              <w:left w:val="single" w:sz="1" w:space="0" w:color="CCCCCC"/>
+              <w:bottom w:val="single" w:sz="1" w:space="0" w:color="CCCCCC"/>
+              <w:right w:val="single" w:sz="1" w:space="0" w:color="CCCCCC"/>
+            </w:tcBorders>
+            <w:tcMar>
+              <w:top w:w="60" w:type="dxa"/>
+              <w:left w:w="100" w:type="dxa"/>
+              <w:bottom w:w="60" w:type="dxa"/>
+              <w:right w:w="100" w:type="dxa"/>
+            </w:tcMar>
+          </w:tcPr>
+          <w:p>
+            <w:r>
+              <w:rPr>
+                <w:sz w:val="19"/>
+                <w:szCs w:val="19"/>
+              </w:rPr>
+              <w:t xml:space="preserve">Admin dashboard KPIs (s-admin screen). Response: { totalMembers, newMembersThisMonth, activeVolunteers, activeRatePct, volunteerHoursMonth, activeProjects, pendingApplications }</w:t>
+            </w:r>
+          </w:p>
+        </w:tc>
+      </w:tr>
+      <w:tr>
+        <w:tblPrEx>
+          <w:tblCellMar>
+            <w:top w:w="0" w:type="dxa"/>
+            <w:bottom w:w="0" w:type="dxa"/>
+          </w:tblCellMar>
+        </w:tblPrEx>
+        <w:tc>
+          <w:tcPr>
+            <w:tcW w:w="1100" w:type="dxa"/>
+            <w:tcBorders>
+              <w:top w:val="single" w:sz="1" w:space="0" w:color="CCCCCC"/>
+              <w:left w:val="single" w:sz="1" w:space="0" w:color="CCCCCC"/>
+              <w:bottom w:val="single" w:sz="1" w:space="0" w:color="CCCCCC"/>
+              <w:right w:val="single" w:sz="1" w:space="0" w:color="CCCCCC"/>
+            </w:tcBorders>
+            <w:shd w:val="clear" w:color="auto" w:fill="27AE60"/>
+            <w:tcMar>
+              <w:top w:w="60" w:type="dxa"/>
+              <w:left w:w="100" w:type="dxa"/>
+              <w:bottom w:w="60" w:type="dxa"/>
+              <w:right w:w="100" w:type="dxa"/>
+            </w:tcMar>
+          </w:tcPr>
+          <w:p>
+            <w:r>
+              <w:rPr>
+                <w:rFonts w:ascii="Courier New" w:eastAsia="Courier New" w:hAnsi="Courier New" w:cs="Courier New"/>
+                <w:b/>
+                <w:bCs/>
+                <w:color w:val="FFFFFF"/>
+                <w:sz w:val="17"/>
+                <w:szCs w:val="17"/>
+              </w:rPr>
+              <w:t>GET</w:t>
+            </w:r>
+          </w:p>
+        </w:tc>
+        <w:tc>
+          <w:tcPr>
+            <w:tcW w:w="3900" w:type="dxa"/>
+            <w:tcBorders>
+              <w:top w:val="single" w:sz="1" w:space="0" w:color="CCCCCC"/>
+              <w:left w:val="single" w:sz="1" w:space="0" w:color="CCCCCC"/>
+              <w:bottom w:val="single" w:sz="1" w:space="0" w:color="CCCCCC"/>
+              <w:right w:val="single" w:sz="1" w:space="0" w:color="CCCCCC"/>
+            </w:tcBorders>
+            <w:tcMar>
+              <w:top w:w="60" w:type="dxa"/>
+              <w:left w:w="100" w:type="dxa"/>
+              <w:bottom w:w="60" w:type="dxa"/>
+              <w:right w:w="100" w:type="dxa"/>
+            </w:tcMar>
+          </w:tcPr>
+          <w:p>
+            <w:r>
+              <w:rPr>
+                <w:rFonts w:ascii="Courier New" w:eastAsia="Courier New" w:hAnsi="Courier New" w:cs="Courier New"/>
+                <w:color w:val="2C3E50"/>
+                <w:sz w:val="17"/>
+                <w:szCs w:val="17"/>
+              </w:rPr>
+              <w:t xml:space="preserve">/org/recommended</w:t>
+            </w:r>
+          </w:p>
+        </w:tc>
+        <w:tc>
+          <w:tcPr>
+            <w:tcW w:w="700" w:type="dxa"/>
+            <w:tcBorders>
+              <w:top w:val="single" w:sz="1" w:space="0" w:color="CCCCCC"/>
+              <w:left w:val="single" w:sz="1" w:space="0" w:color="CCCCCC"/>
+              <w:bottom w:val="single" w:sz="1" w:space="0" w:color="CCCCCC"/>
+              <w:right w:val="single" w:sz="1" w:space="0" w:color="CCCCCC"/>
+            </w:tcBorders>
+            <w:tcMar>
+              <w:top w:w="60" w:type="dxa"/>
+              <w:left w:w="80" w:type="dxa"/>
+              <w:bottom w:w="60" w:type="dxa"/>
+              <w:right w:w="80" w:type="dxa"/>
+            </w:tcMar>
+          </w:tcPr>
+          <w:p>
+            <w:pPr>
+              <w:jc w:val="center"/>
+            </w:pPr>
+            <w:r>
+              <w:rPr>
+                <w:b/>
+                <w:bCs/>
+                <w:color w:val="1A7340"/>
+                <w:sz w:val="17"/>
+                <w:szCs w:val="17"/>
+              </w:rPr>
+              <w:t>YES</w:t>
+            </w:r>
+          </w:p>
+        </w:tc>
+        <w:tc>
+          <w:tcPr>
+            <w:tcW w:w="3660" w:type="dxa"/>
+            <w:tcBorders>
+              <w:top w:val="single" w:sz="1" w:space="0" w:color="CCCCCC"/>
+              <w:left w:val="single" w:sz="1" w:space="0" w:color="CCCCCC"/>
+              <w:bottom w:val="single" w:sz="1" w:space="0" w:color="CCCCCC"/>
+              <w:right w:val="single" w:sz="1" w:space="0" w:color="CCCCCC"/>
+            </w:tcBorders>
+            <w:tcMar>
+              <w:top w:w="60" w:type="dxa"/>
+              <w:left w:w="100" w:type="dxa"/>
+              <w:bottom w:w="60" w:type="dxa"/>
+              <w:right w:w="100" w:type="dxa"/>
+            </w:tcMar>
+          </w:tcPr>
+          <w:p>
+            <w:r>
+              <w:rPr>
+                <w:sz w:val="19"/>
+                <w:szCs w:val="19"/>
+              </w:rPr>
+              <w:t xml:space="preserve">Recommended NGOs matched to user interests (s-explore Recommended tab). Response: [{ orgId, orgName, category, logoUrl, city, state, memberCount, avgRating, latitude, longitude, matchScore }]</w:t>
+            </w:r>
+          </w:p>
+        </w:tc>
+      </w:tr>
+      <w:tr>
+        <w:tblPrEx>
+          <w:tblCellMar>
+            <w:top w:w="0" w:type="dxa"/>
+            <w:bottom w:w="0" w:type="dxa"/>
+          </w:tblCellMar>
+        </w:tblPrEx>
+        <w:tc>
+          <w:tcPr>
+            <w:tcW w:w="1100" w:type="dxa"/>
+            <w:tcBorders>
+              <w:top w:val="single" w:sz="1" w:space="0" w:color="CCCCCC"/>
+              <w:left w:val="single" w:sz="1" w:space="0" w:color="CCCCCC"/>
+              <w:bottom w:val="single" w:sz="1" w:space="0" w:color="CCCCCC"/>
+              <w:right w:val="single" w:sz="1" w:space="0" w:color="CCCCCC"/>
+            </w:tcBorders>
+            <w:shd w:val="clear" w:color="auto" w:fill="27AE60"/>
+            <w:tcMar>
+              <w:top w:w="60" w:type="dxa"/>
+              <w:left w:w="100" w:type="dxa"/>
+              <w:bottom w:w="60" w:type="dxa"/>
+              <w:right w:w="100" w:type="dxa"/>
+            </w:tcMar>
+          </w:tcPr>
+          <w:p>
+            <w:r>
+              <w:rPr>
+                <w:rFonts w:ascii="Courier New" w:eastAsia="Courier New" w:hAnsi="Courier New" w:cs="Courier New"/>
+                <w:b/>
+                <w:bCs/>
+                <w:color w:val="FFFFFF"/>
+                <w:sz w:val="17"/>
+                <w:szCs w:val="17"/>
+              </w:rPr>
+              <w:t>GET</w:t>
+            </w:r>
+          </w:p>
+        </w:tc>
+        <w:tc>
+          <w:tcPr>
+            <w:tcW w:w="3900" w:type="dxa"/>
+            <w:tcBorders>
+              <w:top w:val="single" w:sz="1" w:space="0" w:color="CCCCCC"/>
+              <w:left w:val="single" w:sz="1" w:space="0" w:color="CCCCCC"/>
+              <w:bottom w:val="single" w:sz="1" w:space="0" w:color="CCCCCC"/>
+              <w:right w:val="single" w:sz="1" w:space="0" w:color="CCCCCC"/>
+            </w:tcBorders>
+            <w:tcMar>
+              <w:top w:w="60" w:type="dxa"/>
+              <w:left w:w="100" w:type="dxa"/>
+              <w:bottom w:w="60" w:type="dxa"/>
+              <w:right w:w="100" w:type="dxa"/>
+            </w:tcMar>
+          </w:tcPr>
+          <w:p>
+            <w:r>
+              <w:rPr>
+                <w:rFonts w:ascii="Courier New" w:eastAsia="Courier New" w:hAnsi="Courier New" w:cs="Courier New"/>
+                <w:color w:val="2C3E50"/>
+                <w:sz w:val="17"/>
+                <w:szCs w:val="17"/>
+              </w:rPr>
+              <w:t xml:space="preserve">/org/trending-campaigns</w:t>
+            </w:r>
+          </w:p>
+        </w:tc>
+        <w:tc>
+          <w:tcPr>
+            <w:tcW w:w="700" w:type="dxa"/>
+            <w:tcBorders>
+              <w:top w:val="single" w:sz="1" w:space="0" w:color="CCCCCC"/>
+              <w:left w:val="single" w:sz="1" w:space="0" w:color="CCCCCC"/>
+              <w:bottom w:val="single" w:sz="1" w:space="0" w:color="CCCCCC"/>
+              <w:right w:val="single" w:sz="1" w:space="0" w:color="CCCCCC"/>
+            </w:tcBorders>
+            <w:tcMar>
+              <w:top w:w="60" w:type="dxa"/>
+              <w:left w:w="80" w:type="dxa"/>
+              <w:bottom w:w="60" w:type="dxa"/>
+              <w:right w:w="80" w:type="dxa"/>
+            </w:tcMar>
+          </w:tcPr>
+          <w:p>
+            <w:pPr>
+              <w:jc w:val="center"/>
+            </w:pPr>
+            <w:r>
+              <w:rPr>
+                <w:b/>
+                <w:bCs/>
+                <w:color w:val="7F8C8D"/>
+                <w:sz w:val="17"/>
+                <w:szCs w:val="17"/>
+              </w:rPr>
+              <w:t>—</w:t>
+            </w:r>
+          </w:p>
+        </w:tc>
+        <w:tc>
+          <w:tcPr>
+            <w:tcW w:w="3660" w:type="dxa"/>
+            <w:tcBorders>
+              <w:top w:val="single" w:sz="1" w:space="0" w:color="CCCCCC"/>
+              <w:left w:val="single" w:sz="1" w:space="0" w:color="CCCCCC"/>
+              <w:bottom w:val="single" w:sz="1" w:space="0" w:color="CCCCCC"/>
+              <w:right w:val="single" w:sz="1" w:space="0" w:color="CCCCCC"/>
+            </w:tcBorders>
+            <w:tcMar>
+              <w:top w:w="60" w:type="dxa"/>
+              <w:left w:w="100" w:type="dxa"/>
+              <w:bottom w:w="60" w:type="dxa"/>
+              <w:right w:w="100" w:type="dxa"/>
+            </w:tcMar>
+          </w:tcPr>
+          <w:p>
+            <w:r>
+              <w:rPr>
+                <w:sz w:val="19"/>
+                <w:szCs w:val="19"/>
+              </w:rPr>
+              <w:t xml:space="preserve">Trending active campaigns (s-explore Trending tab). Query: pageSize (default 10). Response: [{ campaignId, campaignName, orgName, orgLogoUrl, raisedAmount, targetAmount, donorCount, progressPct, endDate, bannerUrl, isEmergency }]</w:t>
+            </w:r>
+          </w:p>
+        </w:tc>
+      </w:tr>
+      <w:tr>
+        <w:tblPrEx>
+          <w:tblCellMar>
+            <w:top w:w="0" w:type="dxa"/>
+            <w:bottom w:w="0" w:type="dxa"/>
+          </w:tblCellMar>
+        </w:tblPrEx>
+        <w:tc>
+          <w:tcPr>
+            <w:tcW w:w="1100" w:type="dxa"/>
+            <w:tcBorders>
+              <w:top w:val="single" w:sz="1" w:space="0" w:color="CCCCCC"/>
+              <w:left w:val="single" w:sz="1" w:space="0" w:color="CCCCCC"/>
+              <w:bottom w:val="single" w:sz="1" w:space="0" w:color="CCCCCC"/>
+              <w:right w:val="single" w:sz="1" w:space="0" w:color="CCCCCC"/>
+            </w:tcBorders>
+            <w:shd w:val="clear" w:color="auto" w:fill="27AE60"/>
+            <w:tcMar>
+              <w:top w:w="60" w:type="dxa"/>
+              <w:left w:w="100" w:type="dxa"/>
+              <w:bottom w:w="60" w:type="dxa"/>
+              <w:right w:w="100" w:type="dxa"/>
+            </w:tcMar>
+          </w:tcPr>
+          <w:p>
+            <w:r>
+              <w:rPr>
+                <w:rFonts w:ascii="Courier New" w:eastAsia="Courier New" w:hAnsi="Courier New" w:cs="Courier New"/>
+                <w:b/>
+                <w:bCs/>
+                <w:color w:val="FFFFFF"/>
+                <w:sz w:val="17"/>
+                <w:szCs w:val="17"/>
+              </w:rPr>
+              <w:t>GET</w:t>
+            </w:r>
+          </w:p>
+        </w:tc>
+        <w:tc>
+          <w:tcPr>
+            <w:tcW w:w="3900" w:type="dxa"/>
+            <w:tcBorders>
+              <w:top w:val="single" w:sz="1" w:space="0" w:color="CCCCCC"/>
+              <w:left w:val="single" w:sz="1" w:space="0" w:color="CCCCCC"/>
+              <w:bottom w:val="single" w:sz="1" w:space="0" w:color="CCCCCC"/>
+              <w:right w:val="single" w:sz="1" w:space="0" w:color="CCCCCC"/>
+            </w:tcBorders>
+            <w:tcMar>
+              <w:top w:w="60" w:type="dxa"/>
+              <w:left w:w="100" w:type="dxa"/>
+              <w:bottom w:w="60" w:type="dxa"/>
+              <w:right w:w="100" w:type="dxa"/>
+            </w:tcMar>
+          </w:tcPr>
+          <w:p>
+            <w:r>
+              <w:rPr>
+                <w:rFonts w:ascii="Courier New" w:eastAsia="Courier New" w:hAnsi="Courier New" w:cs="Courier New"/>
+                <w:color w:val="2C3E50"/>
+                <w:sz w:val="17"/>
+                <w:szCs w:val="17"/>
+              </w:rPr>
+              <w:t xml:space="preserve">/org/{orgId}/donation-dashboard</w:t>
+            </w:r>
+          </w:p>
+        </w:tc>
+        <w:tc>
+          <w:tcPr>
+            <w:tcW w:w="700" w:type="dxa"/>
+            <w:tcBorders>
+              <w:top w:val="single" w:sz="1" w:space="0" w:color="CCCCCC"/>
+              <w:left w:val="single" w:sz="1" w:space="0" w:color="CCCCCC"/>
+              <w:bottom w:val="single" w:sz="1" w:space="0" w:color="CCCCCC"/>
+              <w:right w:val="single" w:sz="1" w:space="0" w:color="CCCCCC"/>
+            </w:tcBorders>
+            <w:tcMar>
+              <w:top w:w="60" w:type="dxa"/>
+              <w:left w:w="80" w:type="dxa"/>
+              <w:bottom w:w="60" w:type="dxa"/>
+              <w:right w:w="80" w:type="dxa"/>
+            </w:tcMar>
+          </w:tcPr>
+          <w:p>
+            <w:pPr>
+              <w:jc w:val="center"/>
+            </w:pPr>
+            <w:r>
+              <w:rPr>
+                <w:b/>
+                <w:bCs/>
+                <w:color w:val="1A7340"/>
+                <w:sz w:val="17"/>
+                <w:szCs w:val="17"/>
+              </w:rPr>
+              <w:t>YES</w:t>
+            </w:r>
+          </w:p>
+        </w:tc>
+        <w:tc>
+          <w:tcPr>
+            <w:tcW w:w="3660" w:type="dxa"/>
+            <w:tcBorders>
+              <w:top w:val="single" w:sz="1" w:space="0" w:color="CCCCCC"/>
+              <w:left w:val="single" w:sz="1" w:space="0" w:color="CCCCCC"/>
+              <w:bottom w:val="single" w:sz="1" w:space="0" w:color="CCCCCC"/>
+              <w:right w:val="single" w:sz="1" w:space="0" w:color="CCCCCC"/>
+            </w:tcBorders>
+            <w:tcMar>
+              <w:top w:w="60" w:type="dxa"/>
+              <w:left w:w="100" w:type="dxa"/>
+              <w:bottom w:w="60" w:type="dxa"/>
+              <w:right w:w="100" w:type="dxa"/>
+            </w:tcMar>
+          </w:tcPr>
+          <w:p>
+            <w:r>
+              <w:rPr>
+                <w:sz w:val="19"/>
+                <w:szCs w:val="19"/>
+              </w:rPr>
+              <w:t xml:space="preserve">Donation KPIs for admin (s-admin-donations screen). Response: { totalRaisedAllTime, thisMonthRaised, lastMonthRaised, todayRaised, todayTransactionCount, recurringMonthlyAmount, activeRecurringDonors, totalCampaigns, activeCampaigns }</w:t>
+            </w:r>
+          </w:p>
+        </w:tc>
+      </w:tr>
+      <w:tr>
+        <w:tblPrEx>
+          <w:tblCellMar>
+            <w:top w:w="0" w:type="dxa"/>
+            <w:bottom w:w="0" w:type="dxa"/>
+          </w:tblCellMar>
+        </w:tblPrEx>
+        <w:tc>
+          <w:tcPr>
+            <w:tcW w:w="1100" w:type="dxa"/>
+            <w:tcBorders>
+              <w:top w:val="single" w:sz="1" w:space="0" w:color="CCCCCC"/>
+              <w:left w:val="single" w:sz="1" w:space="0" w:color="CCCCCC"/>
+              <w:bottom w:val="single" w:sz="1" w:space="0" w:color="CCCCCC"/>
+              <w:right w:val="single" w:sz="1" w:space="0" w:color="CCCCCC"/>
+            </w:tcBorders>
+            <w:shd w:val="clear" w:color="auto" w:fill="E67E22"/>
+            <w:tcMar>
+              <w:top w:w="60" w:type="dxa"/>
+              <w:left w:w="100" w:type="dxa"/>
+              <w:bottom w:w="60" w:type="dxa"/>
+              <w:right w:w="100" w:type="dxa"/>
+            </w:tcMar>
+          </w:tcPr>
+          <w:p>
+            <w:r>
+              <w:rPr>
+                <w:rFonts w:ascii="Courier New" w:eastAsia="Courier New" w:hAnsi="Courier New" w:cs="Courier New"/>
+                <w:b/>
+                <w:bCs/>
+                <w:color w:val="FFFFFF"/>
+                <w:sz w:val="17"/>
+                <w:szCs w:val="17"/>
+              </w:rPr>
+              <w:t>PUT</w:t>
+            </w:r>
+          </w:p>
+        </w:tc>
+        <w:tc>
+          <w:tcPr>
+            <w:tcW w:w="3900" w:type="dxa"/>
+            <w:tcBorders>
+              <w:top w:val="single" w:sz="1" w:space="0" w:color="CCCCCC"/>
+              <w:left w:val="single" w:sz="1" w:space="0" w:color="CCCCCC"/>
+              <w:bottom w:val="single" w:sz="1" w:space="0" w:color="CCCCCC"/>
+              <w:right w:val="single" w:sz="1" w:space="0" w:color="CCCCCC"/>
+            </w:tcBorders>
+            <w:tcMar>
+              <w:top w:w="60" w:type="dxa"/>
+              <w:left w:w="100" w:type="dxa"/>
+              <w:bottom w:w="60" w:type="dxa"/>
+              <w:right w:w="100" w:type="dxa"/>
+            </w:tcMar>
+          </w:tcPr>
+          <w:p>
+            <w:r>
+              <w:rPr>
+                <w:rFonts w:ascii="Courier New" w:eastAsia="Courier New" w:hAnsi="Courier New" w:cs="Courier New"/>
+                <w:color w:val="2C3E50"/>
+                <w:sz w:val="17"/>
+                <w:szCs w:val="17"/>
+              </w:rPr>
+              <w:t xml:space="preserve">/org/{orgId}/members/role</w:t>
+            </w:r>
+          </w:p>
+        </w:tc>
+        <w:tc>
+          <w:tcPr>
+            <w:tcW w:w="700" w:type="dxa"/>
+            <w:tcBorders>
+              <w:top w:val="single" w:sz="1" w:space="0" w:color="CCCCCC"/>
+              <w:left w:val="single" w:sz="1" w:space="0" w:color="CCCCCC"/>
+              <w:bottom w:val="single" w:sz="1" w:space="0" w:color="CCCCCC"/>
+              <w:right w:val="single" w:sz="1" w:space="0" w:color="CCCCCC"/>
+            </w:tcBorders>
+            <w:tcMar>
+              <w:top w:w="60" w:type="dxa"/>
+              <w:left w:w="80" w:type="dxa"/>
+              <w:bottom w:w="60" w:type="dxa"/>
+              <w:right w:w="80" w:type="dxa"/>
+            </w:tcMar>
+          </w:tcPr>
+          <w:p>
+            <w:pPr>
+              <w:jc w:val="center"/>
+            </w:pPr>
+            <w:r>
+              <w:rPr>
+                <w:b/>
+                <w:bCs/>
+                <w:color w:val="1A7340"/>
+                <w:sz w:val="17"/>
+                <w:szCs w:val="17"/>
+              </w:rPr>
+              <w:t>YES</w:t>
+            </w:r>
+          </w:p>
+        </w:tc>
+        <w:tc>
+          <w:tcPr>
+            <w:tcW w:w="3660" w:type="dxa"/>
+            <w:tcBorders>
+              <w:top w:val="single" w:sz="1" w:space="0" w:color="CCCCCC"/>
+              <w:left w:val="single" w:sz="1" w:space="0" w:color="CCCCCC"/>
+              <w:bottom w:val="single" w:sz="1" w:space="0" w:color="CCCCCC"/>
+              <w:right w:val="single" w:sz="1" w:space="0" w:color="CCCCCC"/>
+            </w:tcBorders>
+            <w:tcMar>
+              <w:top w:w="60" w:type="dxa"/>
+              <w:left w:w="100" w:type="dxa"/>
+              <w:bottom w:w="60" w:type="dxa"/>
+              <w:right w:w="100" w:type="dxa"/>
+            </w:tcMar>
+          </w:tcPr>
+          <w:p>
+            <w:r>
+              <w:rPr>
+                <w:sz w:val="19"/>
+                <w:szCs w:val="19"/>
+              </w:rPr>
+              <w:t xml:space="preserve">Update a member&amp;#x2019;s role (s-admin-vols screen). Body: { memberId, roleLkpId }. LookupType: MEMBER_ROLE</w:t>
+            </w:r>
+          </w:p>
+        </w:tc>
+      </w:tr>
+      <w:tr>
+        <w:tblPrEx>
+          <w:tblCellMar>
+            <w:top w:w="0" w:type="dxa"/>
+            <w:bottom w:w="0" w:type="dxa"/>
+          </w:tblCellMar>
+        </w:tblPrEx>
+        <w:tc>
+          <w:tcPr>
+            <w:tcW w:w="1100" w:type="dxa"/>
+            <w:tcBorders>
+              <w:top w:val="single" w:sz="1" w:space="0" w:color="CCCCCC"/>
+              <w:left w:val="single" w:sz="1" w:space="0" w:color="CCCCCC"/>
+              <w:bottom w:val="single" w:sz="1" w:space="0" w:color="CCCCCC"/>
+              <w:right w:val="single" w:sz="1" w:space="0" w:color="CCCCCC"/>
+            </w:tcBorders>
+            <w:shd w:val="clear" w:color="auto" w:fill="27AE60"/>
+            <w:tcMar>
+              <w:top w:w="60" w:type="dxa"/>
+              <w:left w:w="100" w:type="dxa"/>
+              <w:bottom w:w="60" w:type="dxa"/>
+              <w:right w:w="100" w:type="dxa"/>
+            </w:tcMar>
+          </w:tcPr>
+          <w:p>
+            <w:r>
+              <w:rPr>
+                <w:rFonts w:ascii="Courier New" w:eastAsia="Courier New" w:hAnsi="Courier New" w:cs="Courier New"/>
+                <w:b/>
+                <w:bCs/>
+                <w:color w:val="FFFFFF"/>
+                <w:sz w:val="17"/>
+                <w:szCs w:val="17"/>
+              </w:rPr>
+              <w:t>GET</w:t>
+            </w:r>
+          </w:p>
+        </w:tc>
+        <w:tc>
+          <w:tcPr>
+            <w:tcW w:w="3900" w:type="dxa"/>
+            <w:tcBorders>
+              <w:top w:val="single" w:sz="1" w:space="0" w:color="CCCCCC"/>
+              <w:left w:val="single" w:sz="1" w:space="0" w:color="CCCCCC"/>
+              <w:bottom w:val="single" w:sz="1" w:space="0" w:color="CCCCCC"/>
+              <w:right w:val="single" w:sz="1" w:space="0" w:color="CCCCCC"/>
+            </w:tcBorders>
+            <w:tcMar>
+              <w:top w:w="60" w:type="dxa"/>
+              <w:left w:w="100" w:type="dxa"/>
+              <w:bottom w:w="60" w:type="dxa"/>
+              <w:right w:w="100" w:type="dxa"/>
+            </w:tcMar>
+          </w:tcPr>
+          <w:p>
+            <w:r>
+              <w:rPr>
+                <w:rFonts w:ascii="Courier New" w:eastAsia="Courier New" w:hAnsi="Courier New" w:cs="Courier New"/>
+                <w:color w:val="2C3E50"/>
+                <w:sz w:val="17"/>
+                <w:szCs w:val="17"/>
+              </w:rPr>
+              <w:t xml:space="preserve">/org/{orgId}/volunteers/{userId}</w:t>
+            </w:r>
+          </w:p>
+        </w:tc>
+        <w:tc>
+          <w:tcPr>
+            <w:tcW w:w="700" w:type="dxa"/>
+            <w:tcBorders>
+              <w:top w:val="single" w:sz="1" w:space="0" w:color="CCCCCC"/>
+              <w:left w:val="single" w:sz="1" w:space="0" w:color="CCCCCC"/>
+              <w:bottom w:val="single" w:sz="1" w:space="0" w:color="CCCCCC"/>
+              <w:right w:val="single" w:sz="1" w:space="0" w:color="CCCCCC"/>
+            </w:tcBorders>
+            <w:tcMar>
+              <w:top w:w="60" w:type="dxa"/>
+              <w:left w:w="80" w:type="dxa"/>
+              <w:bottom w:w="60" w:type="dxa"/>
+              <w:right w:w="80" w:type="dxa"/>
+            </w:tcMar>
+          </w:tcPr>
+          <w:p>
+            <w:pPr>
+              <w:jc w:val="center"/>
+            </w:pPr>
+            <w:r>
+              <w:rPr>
+                <w:b/>
+                <w:bCs/>
+                <w:color w:val="1A7340"/>
+                <w:sz w:val="17"/>
+                <w:szCs w:val="17"/>
+              </w:rPr>
+              <w:t>YES</w:t>
+            </w:r>
+          </w:p>
+        </w:tc>
+        <w:tc>
+          <w:tcPr>
+            <w:tcW w:w="3660" w:type="dxa"/>
+            <w:tcBorders>
+              <w:top w:val="single" w:sz="1" w:space="0" w:color="CCCCCC"/>
+              <w:left w:val="single" w:sz="1" w:space="0" w:color="CCCCCC"/>
+              <w:bottom w:val="single" w:sz="1" w:space="0" w:color="CCCCCC"/>
+              <w:right w:val="single" w:sz="1" w:space="0" w:color="CCCCCC"/>
+            </w:tcBorders>
+            <w:tcMar>
+              <w:top w:w="60" w:type="dxa"/>
+              <w:left w:w="100" w:type="dxa"/>
+              <w:bottom w:w="60" w:type="dxa"/>
+              <w:right w:w="100" w:type="dxa"/>
+            </w:tcMar>
+          </w:tcPr>
+          <w:p>
+            <w:r>
+              <w:rPr>
+                <w:sz w:val="19"/>
+                <w:szCs w:val="19"/>
+              </w:rPr>
+              <w:t xml:space="preserve">Admin view of volunteer profile (s-vol-profile screen). Includes reliability score (never public). Response: { userId, fullName, city, occupation, profilePhoto, totalHours, projectCount, orgCount, reliabilityPct, avgRating, peerRating, noShowCount, excusedCount, complaintCount, roleCode, roleName, statusCode, statusName, joinedAt }</w:t>
+            </w:r>
+          </w:p>
+        </w:tc>
+      </w:tr>
+      <w:tr>
+        <w:tblPrEx>
+          <w:tblCellMar>
+            <w:top w:w="0" w:type="dxa"/>
+            <w:bottom w:w="0" w:type="dxa"/>
+          </w:tblCellMar>
+        </w:tblPrEx>
+        <w:tc>
+          <w:tcPr>
+            <w:tcW w:w="1100" w:type="dxa"/>
+            <w:tcBorders>
+              <w:top w:val="single" w:sz="1" w:space="0" w:color="CCCCCC"/>
+              <w:left w:val="single" w:sz="1" w:space="0" w:color="CCCCCC"/>
+              <w:bottom w:val="single" w:sz="1" w:space="0" w:color="CCCCCC"/>
+              <w:right w:val="single" w:sz="1" w:space="0" w:color="CCCCCC"/>
+            </w:tcBorders>
+            <w:shd w:val="clear" w:color="auto" w:fill="27AE60"/>
+            <w:tcMar>
+              <w:top w:w="60" w:type="dxa"/>
+              <w:left w:w="100" w:type="dxa"/>
+              <w:bottom w:w="60" w:type="dxa"/>
+              <w:right w:w="100" w:type="dxa"/>
+            </w:tcMar>
+          </w:tcPr>
+          <w:p>
+            <w:r>
+              <w:rPr>
+                <w:rFonts w:ascii="Courier New" w:eastAsia="Courier New" w:hAnsi="Courier New" w:cs="Courier New"/>
+                <w:b/>
+                <w:bCs/>
+                <w:color w:val="FFFFFF"/>
+                <w:sz w:val="17"/>
+                <w:szCs w:val="17"/>
+              </w:rPr>
+              <w:t>GET</w:t>
+            </w:r>
+          </w:p>
+        </w:tc>
+        <w:tc>
+          <w:tcPr>
+            <w:tcW w:w="3900" w:type="dxa"/>
+            <w:tcBorders>
+              <w:top w:val="single" w:sz="1" w:space="0" w:color="CCCCCC"/>
+              <w:left w:val="single" w:sz="1" w:space="0" w:color="CCCCCC"/>
+              <w:bottom w:val="single" w:sz="1" w:space="0" w:color="CCCCCC"/>
+              <w:right w:val="single" w:sz="1" w:space="0" w:color="CCCCCC"/>
+            </w:tcBorders>
+            <w:tcMar>
+              <w:top w:w="60" w:type="dxa"/>
+              <w:left w:w="100" w:type="dxa"/>
+              <w:bottom w:w="60" w:type="dxa"/>
+              <w:right w:w="100" w:type="dxa"/>
+            </w:tcMar>
+          </w:tcPr>
+          <w:p>
+            <w:r>
+              <w:rPr>
+                <w:rFonts w:ascii="Courier New" w:eastAsia="Courier New" w:hAnsi="Courier New" w:cs="Courier New"/>
+                <w:color w:val="2C3E50"/>
+                <w:sz w:val="17"/>
+                <w:szCs w:val="17"/>
+              </w:rPr>
+              <w:t xml:space="preserve">/org/{orgId}/members/{userId}/impact</w:t>
+            </w:r>
+          </w:p>
+        </w:tc>
+        <w:tc>
+          <w:tcPr>
+            <w:tcW w:w="700" w:type="dxa"/>
+            <w:tcBorders>
+              <w:top w:val="single" w:sz="1" w:space="0" w:color="CCCCCC"/>
+              <w:left w:val="single" w:sz="1" w:space="0" w:color="CCCCCC"/>
+              <w:bottom w:val="single" w:sz="1" w:space="0" w:color="CCCCCC"/>
+              <w:right w:val="single" w:sz="1" w:space="0" w:color="CCCCCC"/>
+            </w:tcBorders>
+            <w:tcMar>
+              <w:top w:w="60" w:type="dxa"/>
+              <w:left w:w="80" w:type="dxa"/>
+              <w:bottom w:w="60" w:type="dxa"/>
+              <w:right w:w="80" w:type="dxa"/>
+            </w:tcMar>
+          </w:tcPr>
+          <w:p>
+            <w:pPr>
+              <w:jc w:val="center"/>
+            </w:pPr>
+            <w:r>
+              <w:rPr>
+                <w:b/>
+                <w:bCs/>
+                <w:color w:val="1A7340"/>
+                <w:sz w:val="17"/>
+                <w:szCs w:val="17"/>
+              </w:rPr>
+              <w:t>YES</w:t>
+            </w:r>
+          </w:p>
+        </w:tc>
+        <w:tc>
+          <w:tcPr>
+            <w:tcW w:w="3660" w:type="dxa"/>
+            <w:tcBorders>
+              <w:top w:val="single" w:sz="1" w:space="0" w:color="CCCCCC"/>
+              <w:left w:val="single" w:sz="1" w:space="0" w:color="CCCCCC"/>
+              <w:bottom w:val="single" w:sz="1" w:space="0" w:color="CCCCCC"/>
+              <w:right w:val="single" w:sz="1" w:space="0" w:color="CCCCCC"/>
+            </w:tcBorders>
+            <w:tcMar>
+              <w:top w:w="60" w:type="dxa"/>
+              <w:left w:w="100" w:type="dxa"/>
+              <w:bottom w:w="60" w:type="dxa"/>
+              <w:right w:w="100" w:type="dxa"/>
+            </w:tcMar>
+          </w:tcPr>
+          <w:p>
+            <w:r>
+              <w:rPr>
+                <w:sz w:val="19"/>
+                <w:szCs w:val="19"/>
+              </w:rPr>
+              <w:t xml:space="preserve">Admin view of member impact (s-member-impact screen). Response: { userId, fullName, occupation, city, roleName, impactScore, reliabilityPct, totalHours, projectCount, orgCount, badgeCount, noShowCount, complaintCount }</w:t>
+            </w:r>
+          </w:p>
+        </w:tc>
+      </w:tr>
+      <w:tr>
+        <w:tblPrEx>
+          <w:tblCellMar>
+            <w:top w:w="0" w:type="dxa"/>
+            <w:bottom w:w="0" w:type="dxa"/>
+          </w:tblCellMar>
+        </w:tblPrEx>
+        <w:tc>
+          <w:tcPr>
+            <w:tcW w:w="1100" w:type="dxa"/>
+            <w:tcBorders>
+              <w:top w:val="single" w:sz="1" w:space="0" w:color="CCCCCC"/>
+              <w:left w:val="single" w:sz="1" w:space="0" w:color="CCCCCC"/>
+              <w:bottom w:val="single" w:sz="1" w:space="0" w:color="CCCCCC"/>
+              <w:right w:val="single" w:sz="1" w:space="0" w:color="CCCCCC"/>
+            </w:tcBorders>
+            <w:shd w:val="clear" w:color="auto" w:fill="2980B9"/>
+            <w:tcMar>
+              <w:top w:w="60" w:type="dxa"/>
+              <w:left w:w="100" w:type="dxa"/>
+              <w:bottom w:w="60" w:type="dxa"/>
+              <w:right w:w="100" w:type="dxa"/>
+            </w:tcMar>
+          </w:tcPr>
+          <w:p>
+            <w:r>
+              <w:rPr>
+                <w:rFonts w:ascii="Courier New" w:eastAsia="Courier New" w:hAnsi="Courier New" w:cs="Courier New"/>
+                <w:b/>
+                <w:bCs/>
+                <w:color w:val="FFFFFF"/>
+                <w:sz w:val="17"/>
+                <w:szCs w:val="17"/>
+              </w:rPr>
+              <w:t>POST</w:t>
+            </w:r>
+          </w:p>
+        </w:tc>
+        <w:tc>
+          <w:tcPr>
+            <w:tcW w:w="3900" w:type="dxa"/>
+            <w:tcBorders>
+              <w:top w:val="single" w:sz="1" w:space="0" w:color="CCCCCC"/>
+              <w:left w:val="single" w:sz="1" w:space="0" w:color="CCCCCC"/>
+              <w:bottom w:val="single" w:sz="1" w:space="0" w:color="CCCCCC"/>
+              <w:right w:val="single" w:sz="1" w:space="0" w:color="CCCCCC"/>
+            </w:tcBorders>
+            <w:tcMar>
+              <w:top w:w="60" w:type="dxa"/>
+              <w:left w:w="100" w:type="dxa"/>
+              <w:bottom w:w="60" w:type="dxa"/>
+              <w:right w:w="100" w:type="dxa"/>
+            </w:tcMar>
+          </w:tcPr>
+          <w:p>
+            <w:r>
+              <w:rPr>
+                <w:rFonts w:ascii="Courier New" w:eastAsia="Courier New" w:hAnsi="Courier New" w:cs="Courier New"/>
+                <w:color w:val="2C3E50"/>
+                <w:sz w:val="17"/>
+                <w:szCs w:val="17"/>
+              </w:rPr>
+              <w:t xml:space="preserve">/org/{orgId}/badges</w:t>
+            </w:r>
+          </w:p>
+        </w:tc>
+        <w:tc>
+          <w:tcPr>
+            <w:tcW w:w="700" w:type="dxa"/>
+            <w:tcBorders>
+              <w:top w:val="single" w:sz="1" w:space="0" w:color="CCCCCC"/>
+              <w:left w:val="single" w:sz="1" w:space="0" w:color="CCCCCC"/>
+              <w:bottom w:val="single" w:sz="1" w:space="0" w:color="CCCCCC"/>
+              <w:right w:val="single" w:sz="1" w:space="0" w:color="CCCCCC"/>
+            </w:tcBorders>
+            <w:tcMar>
+              <w:top w:w="60" w:type="dxa"/>
+              <w:left w:w="80" w:type="dxa"/>
+              <w:bottom w:w="60" w:type="dxa"/>
+              <w:right w:w="80" w:type="dxa"/>
+            </w:tcMar>
+          </w:tcPr>
+          <w:p>
+            <w:pPr>
+              <w:jc w:val="center"/>
+            </w:pPr>
+            <w:r>
+              <w:rPr>
+                <w:b/>
+                <w:bCs/>
+                <w:color w:val="1A7340"/>
+                <w:sz w:val="17"/>
+                <w:szCs w:val="17"/>
+              </w:rPr>
+              <w:t>YES</w:t>
+            </w:r>
+          </w:p>
+        </w:tc>
+        <w:tc>
+          <w:tcPr>
+            <w:tcW w:w="3660" w:type="dxa"/>
+            <w:tcBorders>
+              <w:top w:val="single" w:sz="1" w:space="0" w:color="CCCCCC"/>
+              <w:left w:val="single" w:sz="1" w:space="0" w:color="CCCCCC"/>
+              <w:bottom w:val="single" w:sz="1" w:space="0" w:color="CCCCCC"/>
+              <w:right w:val="single" w:sz="1" w:space="0" w:color="CCCCCC"/>
+            </w:tcBorders>
+            <w:tcMar>
+              <w:top w:w="60" w:type="dxa"/>
+              <w:left w:w="100" w:type="dxa"/>
+              <w:bottom w:w="60" w:type="dxa"/>
+              <w:right w:w="100" w:type="dxa"/>
+            </w:tcMar>
+          </w:tcPr>
+          <w:p>
+            <w:r>
+              <w:rPr>
+                <w:sz w:val="19"/>
+                <w:szCs w:val="19"/>
+              </w:rPr>
+              <w:t xml:space="preserve">Award a badge to a volunteer (s-vol-profile / s-participants screens). Body: { userId, badgeLkpId, projectId? }. LookupType: BADGE_TYPE</w:t>
+            </w:r>
+          </w:p>
+        </w:tc>
+      </w:tr>
+      <w:tr>
+        <w:tblPrEx>
+          <w:tblCellMar>
+            <w:top w:w="0" w:type="dxa"/>
+            <w:bottom w:w="0" w:type="dxa"/>
+          </w:tblCellMar>
+        </w:tblPrEx>
+        <w:tc>
+          <w:tcPr>
+            <w:tcW w:w="1100" w:type="dxa"/>
+            <w:tcBorders>
+              <w:top w:val="single" w:sz="1" w:space="0" w:color="CCCCCC"/>
+              <w:left w:val="single" w:sz="1" w:space="0" w:color="CCCCCC"/>
+              <w:bottom w:val="single" w:sz="1" w:space="0" w:color="CCCCCC"/>
+              <w:right w:val="single" w:sz="1" w:space="0" w:color="CCCCCC"/>
+            </w:tcBorders>
+            <w:shd w:val="clear" w:color="auto" w:fill="2980B9"/>
+            <w:tcMar>
+              <w:top w:w="60" w:type="dxa"/>
+              <w:left w:w="100" w:type="dxa"/>
+              <w:bottom w:w="60" w:type="dxa"/>
+              <w:right w:w="100" w:type="dxa"/>
+            </w:tcMar>
+          </w:tcPr>
+          <w:p>
+            <w:r>
+              <w:rPr>
+                <w:rFonts w:ascii="Courier New" w:eastAsia="Courier New" w:hAnsi="Courier New" w:cs="Courier New"/>
+                <w:b/>
+                <w:bCs/>
+                <w:color w:val="FFFFFF"/>
+                <w:sz w:val="17"/>
+                <w:szCs w:val="17"/>
+              </w:rPr>
+              <w:t>POST</w:t>
+            </w:r>
+          </w:p>
+        </w:tc>
+        <w:tc>
+          <w:tcPr>
+            <w:tcW w:w="3900" w:type="dxa"/>
+            <w:tcBorders>
+              <w:top w:val="single" w:sz="1" w:space="0" w:color="CCCCCC"/>
+              <w:left w:val="single" w:sz="1" w:space="0" w:color="CCCCCC"/>
+              <w:bottom w:val="single" w:sz="1" w:space="0" w:color="CCCCCC"/>
+              <w:right w:val="single" w:sz="1" w:space="0" w:color="CCCCCC"/>
+            </w:tcBorders>
+            <w:tcMar>
+              <w:top w:w="60" w:type="dxa"/>
+              <w:left w:w="100" w:type="dxa"/>
+              <w:bottom w:w="60" w:type="dxa"/>
+              <w:right w:w="100" w:type="dxa"/>
+            </w:tcMar>
+          </w:tcPr>
+          <w:p>
+            <w:r>
+              <w:rPr>
+                <w:rFonts w:ascii="Courier New" w:eastAsia="Courier New" w:hAnsi="Courier New" w:cs="Courier New"/>
+                <w:color w:val="2C3E50"/>
+                <w:sz w:val="17"/>
+                <w:szCs w:val="17"/>
+              </w:rPr>
+              <w:t xml:space="preserve">/org/{orgId}/attendance/excuse</w:t>
+            </w:r>
+          </w:p>
+        </w:tc>
+        <w:tc>
+          <w:tcPr>
+            <w:tcW w:w="700" w:type="dxa"/>
+            <w:tcBorders>
+              <w:top w:val="single" w:sz="1" w:space="0" w:color="CCCCCC"/>
+              <w:left w:val="single" w:sz="1" w:space="0" w:color="CCCCCC"/>
+              <w:bottom w:val="single" w:sz="1" w:space="0" w:color="CCCCCC"/>
+              <w:right w:val="single" w:sz="1" w:space="0" w:color="CCCCCC"/>
+            </w:tcBorders>
+            <w:tcMar>
+              <w:top w:w="60" w:type="dxa"/>
+              <w:left w:w="80" w:type="dxa"/>
+              <w:bottom w:w="60" w:type="dxa"/>
+              <w:right w:w="80" w:type="dxa"/>
+            </w:tcMar>
+          </w:tcPr>
+          <w:p>
+            <w:pPr>
+              <w:jc w:val="center"/>
+            </w:pPr>
+            <w:r>
+              <w:rPr>
+                <w:b/>
+                <w:bCs/>
+                <w:color w:val="1A7340"/>
+                <w:sz w:val="17"/>
+                <w:szCs w:val="17"/>
+              </w:rPr>
+              <w:t>YES</w:t>
+            </w:r>
+          </w:p>
+        </w:tc>
+        <w:tc>
+          <w:tcPr>
+            <w:tcW w:w="3660" w:type="dxa"/>
+            <w:tcBorders>
+              <w:top w:val="single" w:sz="1" w:space="0" w:color="CCCCCC"/>
+              <w:left w:val="single" w:sz="1" w:space="0" w:color="CCCCCC"/>
+              <w:bottom w:val="single" w:sz="1" w:space="0" w:color="CCCCCC"/>
+              <w:right w:val="single" w:sz="1" w:space="0" w:color="CCCCCC"/>
+            </w:tcBorders>
+            <w:tcMar>
+              <w:top w:w="60" w:type="dxa"/>
+              <w:left w:w="100" w:type="dxa"/>
+              <w:bottom w:w="60" w:type="dxa"/>
+              <w:right w:w="100" w:type="dxa"/>
+            </w:tcMar>
+          </w:tcPr>
+          <w:p>
+            <w:r>
+              <w:rPr>
+                <w:sz w:val="19"/>
+                <w:szCs w:val="19"/>
+              </w:rPr>
+              <w:t xml:space="preserve">Excuse a no-show so it doesn&amp;#x2019;t penalise reliability score (s-participants screen). Body: { attendanceId }</w:t>
+            </w:r>
+          </w:p>
+        </w:tc>
+      </w:tr>
+      <w:tr>
+        <w:tblPrEx>
+          <w:tblCellMar>
+            <w:top w:w="0" w:type="dxa"/>
+            <w:bottom w:w="0" w:type="dxa"/>
+          </w:tblCellMar>
+        </w:tblPrEx>
+        <w:tc>
+          <w:tcPr>
+            <w:tcW w:w="1100" w:type="dxa"/>
+            <w:tcBorders>
+              <w:top w:val="single" w:sz="1" w:space="0" w:color="CCCCCC"/>
+              <w:left w:val="single" w:sz="1" w:space="0" w:color="CCCCCC"/>
+              <w:bottom w:val="single" w:sz="1" w:space="0" w:color="CCCCCC"/>
+              <w:right w:val="single" w:sz="1" w:space="0" w:color="CCCCCC"/>
+            </w:tcBorders>
+            <w:shd w:val="clear" w:color="auto" w:fill="27AE60"/>
+            <w:tcMar>
+              <w:top w:w="60" w:type="dxa"/>
+              <w:left w:w="100" w:type="dxa"/>
+              <w:bottom w:w="60" w:type="dxa"/>
+              <w:right w:w="100" w:type="dxa"/>
+            </w:tcMar>
+          </w:tcPr>
+          <w:p>
+            <w:r>
+              <w:rPr>
+                <w:rFonts w:ascii="Courier New" w:eastAsia="Courier New" w:hAnsi="Courier New" w:cs="Courier New"/>
+                <w:b/>
+                <w:bCs/>
+                <w:color w:val="FFFFFF"/>
+                <w:sz w:val="17"/>
+                <w:szCs w:val="17"/>
+              </w:rPr>
+              <w:t>GET</w:t>
+            </w:r>
+          </w:p>
+        </w:tc>
+        <w:tc>
+          <w:tcPr>
+            <w:tcW w:w="3900" w:type="dxa"/>
+            <w:tcBorders>
+              <w:top w:val="single" w:sz="1" w:space="0" w:color="CCCCCC"/>
+              <w:left w:val="single" w:sz="1" w:space="0" w:color="CCCCCC"/>
+              <w:bottom w:val="single" w:sz="1" w:space="0" w:color="CCCCCC"/>
+              <w:right w:val="single" w:sz="1" w:space="0" w:color="CCCCCC"/>
+            </w:tcBorders>
+            <w:tcMar>
+              <w:top w:w="60" w:type="dxa"/>
+              <w:left w:w="100" w:type="dxa"/>
+              <w:bottom w:w="60" w:type="dxa"/>
+              <w:right w:w="100" w:type="dxa"/>
+            </w:tcMar>
+          </w:tcPr>
+          <w:p>
+            <w:r>
+              <w:rPr>
+                <w:rFonts w:ascii="Courier New" w:eastAsia="Courier New" w:hAnsi="Courier New" w:cs="Courier New"/>
+                <w:color w:val="2C3E50"/>
+                <w:sz w:val="17"/>
+                <w:szCs w:val="17"/>
+              </w:rPr>
+              <w:t xml:space="preserve">/org/{orgId}/donors</w:t>
+            </w:r>
+          </w:p>
+        </w:tc>
+        <w:tc>
+          <w:tcPr>
+            <w:tcW w:w="700" w:type="dxa"/>
+            <w:tcBorders>
+              <w:top w:val="single" w:sz="1" w:space="0" w:color="CCCCCC"/>
+              <w:left w:val="single" w:sz="1" w:space="0" w:color="CCCCCC"/>
+              <w:bottom w:val="single" w:sz="1" w:space="0" w:color="CCCCCC"/>
+              <w:right w:val="single" w:sz="1" w:space="0" w:color="CCCCCC"/>
+            </w:tcBorders>
+            <w:tcMar>
+              <w:top w:w="60" w:type="dxa"/>
+              <w:left w:w="80" w:type="dxa"/>
+              <w:bottom w:w="60" w:type="dxa"/>
+              <w:right w:w="80" w:type="dxa"/>
+            </w:tcMar>
+          </w:tcPr>
+          <w:p>
+            <w:pPr>
+              <w:jc w:val="center"/>
+            </w:pPr>
+            <w:r>
+              <w:rPr>
+                <w:b/>
+                <w:bCs/>
+                <w:color w:val="1A7340"/>
+                <w:sz w:val="17"/>
+                <w:szCs w:val="17"/>
+              </w:rPr>
+              <w:t>YES</w:t>
+            </w:r>
+          </w:p>
+        </w:tc>
+        <w:tc>
+          <w:tcPr>
+            <w:tcW w:w="3660" w:type="dxa"/>
+            <w:tcBorders>
+              <w:top w:val="single" w:sz="1" w:space="0" w:color="CCCCCC"/>
+              <w:left w:val="single" w:sz="1" w:space="0" w:color="CCCCCC"/>
+              <w:bottom w:val="single" w:sz="1" w:space="0" w:color="CCCCCC"/>
+              <w:right w:val="single" w:sz="1" w:space="0" w:color="CCCCCC"/>
+            </w:tcBorders>
+            <w:tcMar>
+              <w:top w:w="60" w:type="dxa"/>
+              <w:left w:w="100" w:type="dxa"/>
+              <w:bottom w:w="60" w:type="dxa"/>
+              <w:right w:w="100" w:type="dxa"/>
+            </w:tcMar>
+          </w:tcPr>
+          <w:p>
+            <w:r>
+              <w:rPr>
+                <w:sz w:val="19"/>
+                <w:szCs w:val="19"/>
+              </w:rPr>
+              <w:t xml:space="preserve">Donor list for admin (s-admin-donors screen). Query: tab (ALL|RECURRING|TOP), pageNumber, pageSize. Response: PagedResult of { userId, fullName, email, phone, totalDonated, donationCount, lastDonatedAt, isAnonymous, isRecurring }</w:t>
+            </w:r>
+          </w:p>
+        </w:tc>
+      </w:tr>
+      <w:tr>
+        <w:tblPrEx>
+          <w:tblCellMar>
+            <w:top w:w="0" w:type="dxa"/>
+            <w:bottom w:w="0" w:type="dxa"/>
+          </w:tblCellMar>
+        </w:tblPrEx>
+        <w:tc>
+          <w:tcPr>
+            <w:tcW w:w="1100" w:type="dxa"/>
+            <w:tcBorders>
+              <w:top w:val="single" w:sz="1" w:space="0" w:color="CCCCCC"/>
+              <w:left w:val="single" w:sz="1" w:space="0" w:color="CCCCCC"/>
+              <w:bottom w:val="single" w:sz="1" w:space="0" w:color="CCCCCC"/>
+              <w:right w:val="single" w:sz="1" w:space="0" w:color="CCCCCC"/>
+            </w:tcBorders>
+            <w:shd w:val="clear" w:color="auto" w:fill="27AE60"/>
+            <w:tcMar>
+              <w:top w:w="60" w:type="dxa"/>
+              <w:left w:w="100" w:type="dxa"/>
+              <w:bottom w:w="60" w:type="dxa"/>
+              <w:right w:w="100" w:type="dxa"/>
+            </w:tcMar>
+          </w:tcPr>
+          <w:p>
+            <w:r>
+              <w:rPr>
+                <w:rFonts w:ascii="Courier New" w:eastAsia="Courier New" w:hAnsi="Courier New" w:cs="Courier New"/>
+                <w:b/>
+                <w:bCs/>
+                <w:color w:val="FFFFFF"/>
+                <w:sz w:val="17"/>
+                <w:szCs w:val="17"/>
+              </w:rPr>
+              <w:t>GET</w:t>
+            </w:r>
+          </w:p>
+        </w:tc>
+        <w:tc>
+          <w:tcPr>
+            <w:tcW w:w="3900" w:type="dxa"/>
+            <w:tcBorders>
+              <w:top w:val="single" w:sz="1" w:space="0" w:color="CCCCCC"/>
+              <w:left w:val="single" w:sz="1" w:space="0" w:color="CCCCCC"/>
+              <w:bottom w:val="single" w:sz="1" w:space="0" w:color="CCCCCC"/>
+              <w:right w:val="single" w:sz="1" w:space="0" w:color="CCCCCC"/>
+            </w:tcBorders>
+            <w:tcMar>
+              <w:top w:w="60" w:type="dxa"/>
+              <w:left w:w="100" w:type="dxa"/>
+              <w:bottom w:w="60" w:type="dxa"/>
+              <w:right w:w="100" w:type="dxa"/>
+            </w:tcMar>
+          </w:tcPr>
+          <w:p>
+            <w:r>
+              <w:rPr>
+                <w:rFonts w:ascii="Courier New" w:eastAsia="Courier New" w:hAnsi="Courier New" w:cs="Courier New"/>
+                <w:color w:val="2C3E50"/>
+                <w:sz w:val="17"/>
+                <w:szCs w:val="17"/>
+              </w:rPr>
+              <w:t xml:space="preserve">/org/{orgId}/transactions</w:t>
+            </w:r>
+          </w:p>
+        </w:tc>
+        <w:tc>
+          <w:tcPr>
+            <w:tcW w:w="700" w:type="dxa"/>
+            <w:tcBorders>
+              <w:top w:val="single" w:sz="1" w:space="0" w:color="CCCCCC"/>
+              <w:left w:val="single" w:sz="1" w:space="0" w:color="CCCCCC"/>
+              <w:bottom w:val="single" w:sz="1" w:space="0" w:color="CCCCCC"/>
+              <w:right w:val="single" w:sz="1" w:space="0" w:color="CCCCCC"/>
+            </w:tcBorders>
+            <w:tcMar>
+              <w:top w:w="60" w:type="dxa"/>
+              <w:left w:w="80" w:type="dxa"/>
+              <w:bottom w:w="60" w:type="dxa"/>
+              <w:right w:w="80" w:type="dxa"/>
+            </w:tcMar>
+          </w:tcPr>
+          <w:p>
+            <w:pPr>
+              <w:jc w:val="center"/>
+            </w:pPr>
+            <w:r>
+              <w:rPr>
+                <w:b/>
+                <w:bCs/>
+                <w:color w:val="1A7340"/>
+                <w:sz w:val="17"/>
+                <w:szCs w:val="17"/>
+              </w:rPr>
+              <w:t>YES</w:t>
+            </w:r>
+          </w:p>
+        </w:tc>
+        <w:tc>
+          <w:tcPr>
+            <w:tcW w:w="3660" w:type="dxa"/>
+            <w:tcBorders>
+              <w:top w:val="single" w:sz="1" w:space="0" w:color="CCCCCC"/>
+              <w:left w:val="single" w:sz="1" w:space="0" w:color="CCCCCC"/>
+              <w:bottom w:val="single" w:sz="1" w:space="0" w:color="CCCCCC"/>
+              <w:right w:val="single" w:sz="1" w:space="0" w:color="CCCCCC"/>
+            </w:tcBorders>
+            <w:tcMar>
+              <w:top w:w="60" w:type="dxa"/>
+              <w:left w:w="100" w:type="dxa"/>
+              <w:bottom w:w="60" w:type="dxa"/>
+              <w:right w:w="100" w:type="dxa"/>
+            </w:tcMar>
+          </w:tcPr>
+          <w:p>
+            <w:r>
+              <w:rPr>
+                <w:sz w:val="19"/>
+                <w:szCs w:val="19"/>
+              </w:rPr>
+              <w:t xml:space="preserve">Transaction list for admin (s-admin-transactions screen). Query: statusCode?, pageNumber, pageSize. Response: PagedResult of { transactionId, readableId, donorName, amount, netAmount, campaignName, statusCode, statusName, paymentMethod, createdAt, isAnonymous }</w:t>
             </w:r>
           </w:p>
         </w:tc>

</xml_diff>

<commit_message>
Updated by Gaurav on 04-07-2026
</commit_message>
<xml_diff>
--- a/Documents/API_Documentation_v4.1.docx
+++ b/Documents/API_Documentation_v4.1.docx
@@ -3699,7 +3699,7 @@
                 <w:sz w:val="17"/>
                 <w:szCs w:val="17"/>
               </w:rPr>
-              <w:t xml:space="preserve">/user/my-orgs</w:t>
+              <w:t>/user/orgs</w:t>
             </w:r>
           </w:p>
         </w:tc>
@@ -3757,7 +3757,7 @@
                 <w:sz w:val="19"/>
                 <w:szCs w:val="19"/>
               </w:rPr>
-              <w:t xml:space="preserve">Get all organisations the user is an APPROVED member of (s-my-orgs screen). Response: [{ orgId, orgName, logoUrl, orgType, city, state, role, roleCode, memberCount, joinedAt }]</w:t>
+              <w:t>Response: [{ orgId, orgName, logoUrl, orgType, city, state, role, roleCode, memberStatusCode, orgStatusCode, memberCount, joinedAt }]</w:t>
             </w:r>
           </w:p>
         </w:tc>

</xml_diff>